<commit_message>
Updated QA document for project Mihalik with new revisions.
</commit_message>
<xml_diff>
--- a/assets/tyzden3/3 QA dokument projekt Mihalik.docx
+++ b/assets/tyzden3/3 QA dokument projekt Mihalik.docx
@@ -280,71 +280,68 @@
     </w:p>
     <w:p>
       <w:pPr>
+        <w:rPr>
+          <w:rFonts w:ascii="Times New Roman" w:hAnsi="Times New Roman" w:cs="Times New Roman"/>
+          <w:b/>
+          <w:bCs/>
+          <w:sz w:val="28"/>
+          <w:szCs w:val="28"/>
+          <w:u w:val="single"/>
+        </w:rPr>
+      </w:pPr>
+      <w:r>
+        <w:rPr>
+          <w:rFonts w:ascii="Times New Roman" w:hAnsi="Times New Roman" w:cs="Times New Roman"/>
+          <w:b/>
+          <w:bCs/>
+          <w:sz w:val="28"/>
+          <w:szCs w:val="28"/>
+          <w:u w:val="single"/>
+        </w:rPr>
+        <w:t>Komunikácia</w:t>
+      </w:r>
+      <w:r>
+        <w:rPr>
+          <w:rFonts w:ascii="Times New Roman" w:hAnsi="Times New Roman" w:cs="Times New Roman"/>
+          <w:b/>
+          <w:bCs/>
+          <w:sz w:val="28"/>
+          <w:szCs w:val="28"/>
+          <w:u w:val="single"/>
+        </w:rPr>
+        <w:t xml:space="preserve"> a spolupráca</w:t>
+      </w:r>
+      <w:r>
+        <w:rPr>
+          <w:rFonts w:ascii="Times New Roman" w:hAnsi="Times New Roman" w:cs="Times New Roman"/>
+          <w:b/>
+          <w:bCs/>
+          <w:sz w:val="28"/>
+          <w:szCs w:val="28"/>
+          <w:u w:val="single"/>
+        </w:rPr>
+        <w:t>:</w:t>
+      </w:r>
+    </w:p>
+    <w:p>
+      <w:pPr>
         <w:spacing w:line="360" w:lineRule="auto"/>
         <w:jc w:val="both"/>
         <w:rPr>
           <w:rFonts w:ascii="Times New Roman" w:hAnsi="Times New Roman" w:cs="Times New Roman"/>
-          <w:b/>
-          <w:bCs/>
-          <w:sz w:val="28"/>
-          <w:szCs w:val="28"/>
-          <w:u w:val="single"/>
-        </w:rPr>
-      </w:pPr>
-      <w:r>
-        <w:rPr>
-          <w:rFonts w:ascii="Times New Roman" w:hAnsi="Times New Roman" w:cs="Times New Roman"/>
-          <w:b/>
-          <w:bCs/>
-          <w:sz w:val="28"/>
-          <w:szCs w:val="28"/>
-          <w:u w:val="single"/>
-        </w:rPr>
-        <w:t xml:space="preserve">Dokument </w:t>
-      </w:r>
-      <w:r>
-        <w:rPr>
-          <w:rFonts w:ascii="Times New Roman" w:hAnsi="Times New Roman" w:cs="Times New Roman"/>
-          <w:b/>
-          <w:bCs/>
-          <w:sz w:val="28"/>
-          <w:szCs w:val="28"/>
-          <w:u w:val="single"/>
-        </w:rPr>
-        <w:t xml:space="preserve">podklady </w:t>
-      </w:r>
-      <w:r>
-        <w:rPr>
-          <w:rFonts w:ascii="Times New Roman" w:hAnsi="Times New Roman" w:cs="Times New Roman"/>
-          <w:b/>
-          <w:bCs/>
-          <w:sz w:val="28"/>
-          <w:szCs w:val="28"/>
-          <w:u w:val="single"/>
-        </w:rPr>
-        <w:t>SWOT</w:t>
-      </w:r>
-      <w:r>
-        <w:rPr>
-          <w:rFonts w:ascii="Times New Roman" w:hAnsi="Times New Roman" w:cs="Times New Roman"/>
-          <w:b/>
-          <w:bCs/>
-          <w:sz w:val="28"/>
-          <w:szCs w:val="28"/>
-          <w:u w:val="single"/>
-        </w:rPr>
-        <w:t xml:space="preserve"> analýza</w:t>
-      </w:r>
-      <w:r>
-        <w:rPr>
-          <w:rFonts w:ascii="Times New Roman" w:hAnsi="Times New Roman" w:cs="Times New Roman"/>
-          <w:b/>
-          <w:bCs/>
-          <w:sz w:val="28"/>
-          <w:szCs w:val="28"/>
-          <w:u w:val="single"/>
-        </w:rPr>
-        <w:t>:</w:t>
+        </w:rPr>
+      </w:pPr>
+      <w:r>
+        <w:rPr>
+          <w:rFonts w:ascii="Times New Roman" w:hAnsi="Times New Roman" w:cs="Times New Roman"/>
+        </w:rPr>
+        <w:t xml:space="preserve">(+) – </w:t>
+      </w:r>
+      <w:r>
+        <w:rPr>
+          <w:rFonts w:ascii="Times New Roman" w:hAnsi="Times New Roman" w:cs="Times New Roman"/>
+        </w:rPr>
+        <w:t>Aktívna komunikácia</w:t>
       </w:r>
     </w:p>
     <w:p>
@@ -365,13 +362,7 @@
         <w:rPr>
           <w:rFonts w:ascii="Times New Roman" w:hAnsi="Times New Roman" w:cs="Times New Roman"/>
         </w:rPr>
-        <w:t xml:space="preserve">Jasne vysvetlené </w:t>
-      </w:r>
-      <w:r>
-        <w:rPr>
-          <w:rFonts w:ascii="Times New Roman" w:hAnsi="Times New Roman" w:cs="Times New Roman"/>
-        </w:rPr>
-        <w:t>jednotlivé body v odrážkach</w:t>
+        <w:t>Dobrá spolupráca</w:t>
       </w:r>
     </w:p>
     <w:p>
@@ -386,37 +377,7 @@
         <w:rPr>
           <w:rFonts w:ascii="Times New Roman" w:hAnsi="Times New Roman" w:cs="Times New Roman"/>
         </w:rPr>
-        <w:t xml:space="preserve"> </w:t>
-      </w:r>
-      <w:r>
-        <w:rPr>
-          <w:rFonts w:ascii="Times New Roman" w:hAnsi="Times New Roman" w:cs="Times New Roman"/>
-        </w:rPr>
-        <w:t xml:space="preserve">(+) – </w:t>
-      </w:r>
-      <w:r>
-        <w:rPr>
-          <w:rFonts w:ascii="Times New Roman" w:hAnsi="Times New Roman" w:cs="Times New Roman"/>
-        </w:rPr>
-        <w:t>Logick</w:t>
-      </w:r>
-      <w:r>
-        <w:rPr>
-          <w:rFonts w:ascii="Times New Roman" w:hAnsi="Times New Roman" w:cs="Times New Roman"/>
-        </w:rPr>
-        <w:t>y</w:t>
-      </w:r>
-      <w:r>
-        <w:rPr>
-          <w:rFonts w:ascii="Times New Roman" w:hAnsi="Times New Roman" w:cs="Times New Roman"/>
-        </w:rPr>
-        <w:t xml:space="preserve"> </w:t>
-      </w:r>
-      <w:r>
-        <w:rPr>
-          <w:rFonts w:ascii="Times New Roman" w:hAnsi="Times New Roman" w:cs="Times New Roman"/>
-        </w:rPr>
-        <w:t>usporiadaný obsah</w:t>
+        <w:t>(-) – Žiadne</w:t>
       </w:r>
     </w:p>
     <w:p>
@@ -425,32 +386,13 @@
         <w:jc w:val="both"/>
         <w:rPr>
           <w:rFonts w:ascii="Times New Roman" w:hAnsi="Times New Roman" w:cs="Times New Roman"/>
-        </w:rPr>
-      </w:pPr>
-      <w:r>
-        <w:rPr>
-          <w:rFonts w:ascii="Times New Roman" w:hAnsi="Times New Roman" w:cs="Times New Roman"/>
-        </w:rPr>
-        <w:t xml:space="preserve">(-) </w:t>
-      </w:r>
-      <w:r>
-        <w:rPr>
-          <w:rFonts w:ascii="Times New Roman" w:hAnsi="Times New Roman" w:cs="Times New Roman"/>
-        </w:rPr>
-        <w:t xml:space="preserve">– </w:t>
-      </w:r>
-      <w:r>
-        <w:rPr>
-          <w:rFonts w:ascii="Times New Roman" w:hAnsi="Times New Roman" w:cs="Times New Roman"/>
-        </w:rPr>
-        <w:t>N</w:t>
-      </w:r>
-      <w:r>
-        <w:rPr>
-          <w:rFonts w:ascii="Times New Roman" w:hAnsi="Times New Roman" w:cs="Times New Roman"/>
-        </w:rPr>
-        <w:t>ezarovnaný text</w:t>
-      </w:r>
+          <w:b/>
+          <w:bCs/>
+          <w:sz w:val="28"/>
+          <w:szCs w:val="28"/>
+          <w:u w:val="single"/>
+        </w:rPr>
+      </w:pPr>
     </w:p>
     <w:p>
       <w:pPr>
@@ -474,7 +416,7 @@
           <w:szCs w:val="28"/>
           <w:u w:val="single"/>
         </w:rPr>
-        <w:t>P</w:t>
+        <w:t xml:space="preserve">Dokument </w:t>
       </w:r>
       <w:r>
         <w:rPr>
@@ -485,18 +427,7 @@
           <w:szCs w:val="28"/>
           <w:u w:val="single"/>
         </w:rPr>
-        <w:t>rezentá</w:t>
-      </w:r>
-      <w:r>
-        <w:rPr>
-          <w:rFonts w:ascii="Times New Roman" w:hAnsi="Times New Roman" w:cs="Times New Roman"/>
-          <w:b/>
-          <w:bCs/>
-          <w:sz w:val="28"/>
-          <w:szCs w:val="28"/>
-          <w:u w:val="single"/>
-        </w:rPr>
-        <w:t xml:space="preserve">cia </w:t>
+        <w:t xml:space="preserve">podklady </w:t>
       </w:r>
       <w:r>
         <w:rPr>
@@ -544,31 +475,31 @@
         <w:rPr>
           <w:rFonts w:ascii="Times New Roman" w:hAnsi="Times New Roman" w:cs="Times New Roman"/>
         </w:rPr>
-        <w:t xml:space="preserve">(+) </w:t>
-      </w:r>
-      <w:r>
-        <w:rPr>
-          <w:rFonts w:ascii="Times New Roman" w:hAnsi="Times New Roman" w:cs="Times New Roman"/>
-        </w:rPr>
-        <w:t>–</w:t>
-      </w:r>
-      <w:r>
-        <w:rPr>
-          <w:rFonts w:ascii="Times New Roman" w:hAnsi="Times New Roman" w:cs="Times New Roman"/>
-        </w:rPr>
-        <w:t xml:space="preserve"> </w:t>
-      </w:r>
-      <w:r>
-        <w:rPr>
-          <w:rFonts w:ascii="Times New Roman" w:hAnsi="Times New Roman" w:cs="Times New Roman"/>
-        </w:rPr>
-        <w:t>V</w:t>
-      </w:r>
-      <w:r>
-        <w:rPr>
-          <w:rFonts w:ascii="Times New Roman" w:hAnsi="Times New Roman" w:cs="Times New Roman"/>
-        </w:rPr>
-        <w:t>izuálne spracovanie</w:t>
+        <w:t xml:space="preserve">(+) – </w:t>
+      </w:r>
+      <w:r>
+        <w:rPr>
+          <w:rFonts w:ascii="Times New Roman" w:hAnsi="Times New Roman" w:cs="Times New Roman"/>
+        </w:rPr>
+        <w:t xml:space="preserve">Jasne vysvetlené </w:t>
+      </w:r>
+      <w:r>
+        <w:rPr>
+          <w:rFonts w:ascii="Times New Roman" w:hAnsi="Times New Roman" w:cs="Times New Roman"/>
+        </w:rPr>
+        <w:t>jednotlivé body v</w:t>
+      </w:r>
+      <w:r>
+        <w:rPr>
+          <w:rFonts w:ascii="Times New Roman" w:hAnsi="Times New Roman" w:cs="Times New Roman"/>
+        </w:rPr>
+        <w:t> </w:t>
+      </w:r>
+      <w:r>
+        <w:rPr>
+          <w:rFonts w:ascii="Times New Roman" w:hAnsi="Times New Roman" w:cs="Times New Roman"/>
+        </w:rPr>
+        <w:t>odrážkach</w:t>
       </w:r>
     </w:p>
     <w:p>
@@ -583,6 +514,200 @@
         <w:rPr>
           <w:rFonts w:ascii="Times New Roman" w:hAnsi="Times New Roman" w:cs="Times New Roman"/>
         </w:rPr>
+        <w:t>(+) – Logick</w:t>
+      </w:r>
+      <w:r>
+        <w:rPr>
+          <w:rFonts w:ascii="Times New Roman" w:hAnsi="Times New Roman" w:cs="Times New Roman"/>
+        </w:rPr>
+        <w:t>y</w:t>
+      </w:r>
+      <w:r>
+        <w:rPr>
+          <w:rFonts w:ascii="Times New Roman" w:hAnsi="Times New Roman" w:cs="Times New Roman"/>
+        </w:rPr>
+        <w:t xml:space="preserve"> </w:t>
+      </w:r>
+      <w:r>
+        <w:rPr>
+          <w:rFonts w:ascii="Times New Roman" w:hAnsi="Times New Roman" w:cs="Times New Roman"/>
+        </w:rPr>
+        <w:t>usporiadaný obsah</w:t>
+      </w:r>
+    </w:p>
+    <w:p>
+      <w:pPr>
+        <w:spacing w:line="360" w:lineRule="auto"/>
+        <w:jc w:val="both"/>
+        <w:rPr>
+          <w:rFonts w:ascii="Times New Roman" w:hAnsi="Times New Roman" w:cs="Times New Roman"/>
+        </w:rPr>
+      </w:pPr>
+      <w:r>
+        <w:rPr>
+          <w:rFonts w:ascii="Times New Roman" w:hAnsi="Times New Roman" w:cs="Times New Roman"/>
+        </w:rPr>
+        <w:t xml:space="preserve">(-) </w:t>
+      </w:r>
+      <w:r>
+        <w:rPr>
+          <w:rFonts w:ascii="Times New Roman" w:hAnsi="Times New Roman" w:cs="Times New Roman"/>
+        </w:rPr>
+        <w:t xml:space="preserve">– </w:t>
+      </w:r>
+      <w:r>
+        <w:rPr>
+          <w:rFonts w:ascii="Times New Roman" w:hAnsi="Times New Roman" w:cs="Times New Roman"/>
+        </w:rPr>
+        <w:t>N</w:t>
+      </w:r>
+      <w:r>
+        <w:rPr>
+          <w:rFonts w:ascii="Times New Roman" w:hAnsi="Times New Roman" w:cs="Times New Roman"/>
+        </w:rPr>
+        <w:t>ezarovnaný text</w:t>
+      </w:r>
+    </w:p>
+    <w:p>
+      <w:pPr>
+        <w:spacing w:line="360" w:lineRule="auto"/>
+        <w:jc w:val="both"/>
+        <w:rPr>
+          <w:rFonts w:ascii="Times New Roman" w:hAnsi="Times New Roman" w:cs="Times New Roman"/>
+        </w:rPr>
+      </w:pPr>
+    </w:p>
+    <w:p>
+      <w:pPr>
+        <w:spacing w:line="360" w:lineRule="auto"/>
+        <w:jc w:val="both"/>
+        <w:rPr>
+          <w:rFonts w:ascii="Times New Roman" w:hAnsi="Times New Roman" w:cs="Times New Roman"/>
+          <w:b/>
+          <w:bCs/>
+          <w:sz w:val="28"/>
+          <w:szCs w:val="28"/>
+          <w:u w:val="single"/>
+        </w:rPr>
+      </w:pPr>
+      <w:r>
+        <w:rPr>
+          <w:rFonts w:ascii="Times New Roman" w:hAnsi="Times New Roman" w:cs="Times New Roman"/>
+          <w:b/>
+          <w:bCs/>
+          <w:sz w:val="28"/>
+          <w:szCs w:val="28"/>
+          <w:u w:val="single"/>
+        </w:rPr>
+        <w:t>P</w:t>
+      </w:r>
+      <w:r>
+        <w:rPr>
+          <w:rFonts w:ascii="Times New Roman" w:hAnsi="Times New Roman" w:cs="Times New Roman"/>
+          <w:b/>
+          <w:bCs/>
+          <w:sz w:val="28"/>
+          <w:szCs w:val="28"/>
+          <w:u w:val="single"/>
+        </w:rPr>
+        <w:t>rezentá</w:t>
+      </w:r>
+      <w:r>
+        <w:rPr>
+          <w:rFonts w:ascii="Times New Roman" w:hAnsi="Times New Roman" w:cs="Times New Roman"/>
+          <w:b/>
+          <w:bCs/>
+          <w:sz w:val="28"/>
+          <w:szCs w:val="28"/>
+          <w:u w:val="single"/>
+        </w:rPr>
+        <w:t xml:space="preserve">cia </w:t>
+      </w:r>
+      <w:r>
+        <w:rPr>
+          <w:rFonts w:ascii="Times New Roman" w:hAnsi="Times New Roman" w:cs="Times New Roman"/>
+          <w:b/>
+          <w:bCs/>
+          <w:sz w:val="28"/>
+          <w:szCs w:val="28"/>
+          <w:u w:val="single"/>
+        </w:rPr>
+        <w:t>SWOT</w:t>
+      </w:r>
+      <w:r>
+        <w:rPr>
+          <w:rFonts w:ascii="Times New Roman" w:hAnsi="Times New Roman" w:cs="Times New Roman"/>
+          <w:b/>
+          <w:bCs/>
+          <w:sz w:val="28"/>
+          <w:szCs w:val="28"/>
+          <w:u w:val="single"/>
+        </w:rPr>
+        <w:t xml:space="preserve"> analýza</w:t>
+      </w:r>
+      <w:r>
+        <w:rPr>
+          <w:rFonts w:ascii="Times New Roman" w:hAnsi="Times New Roman" w:cs="Times New Roman"/>
+          <w:b/>
+          <w:bCs/>
+          <w:sz w:val="28"/>
+          <w:szCs w:val="28"/>
+          <w:u w:val="single"/>
+        </w:rPr>
+        <w:t>:</w:t>
+      </w:r>
+    </w:p>
+    <w:p>
+      <w:pPr>
+        <w:spacing w:line="360" w:lineRule="auto"/>
+        <w:jc w:val="both"/>
+        <w:rPr>
+          <w:rFonts w:ascii="Times New Roman" w:hAnsi="Times New Roman" w:cs="Times New Roman"/>
+        </w:rPr>
+      </w:pPr>
+      <w:r>
+        <w:rPr>
+          <w:rFonts w:ascii="Times New Roman" w:hAnsi="Times New Roman" w:cs="Times New Roman"/>
+        </w:rPr>
+        <w:t xml:space="preserve">(+) </w:t>
+      </w:r>
+      <w:r>
+        <w:rPr>
+          <w:rFonts w:ascii="Times New Roman" w:hAnsi="Times New Roman" w:cs="Times New Roman"/>
+        </w:rPr>
+        <w:t>–</w:t>
+      </w:r>
+      <w:r>
+        <w:rPr>
+          <w:rFonts w:ascii="Times New Roman" w:hAnsi="Times New Roman" w:cs="Times New Roman"/>
+        </w:rPr>
+        <w:t xml:space="preserve"> </w:t>
+      </w:r>
+      <w:r>
+        <w:rPr>
+          <w:rFonts w:ascii="Times New Roman" w:hAnsi="Times New Roman" w:cs="Times New Roman"/>
+        </w:rPr>
+        <w:t>V</w:t>
+      </w:r>
+      <w:r>
+        <w:rPr>
+          <w:rFonts w:ascii="Times New Roman" w:hAnsi="Times New Roman" w:cs="Times New Roman"/>
+        </w:rPr>
+        <w:t>izuálne spracovanie</w:t>
+      </w:r>
+    </w:p>
+    <w:p>
+      <w:pPr>
+        <w:spacing w:line="360" w:lineRule="auto"/>
+        <w:jc w:val="both"/>
+        <w:rPr>
+          <w:rFonts w:ascii="Times New Roman" w:hAnsi="Times New Roman" w:cs="Times New Roman"/>
+        </w:rPr>
+      </w:pPr>
+      <w:r>
+        <w:rPr>
+          <w:rFonts w:ascii="Times New Roman" w:hAnsi="Times New Roman" w:cs="Times New Roman"/>
+        </w:rPr>
         <w:t xml:space="preserve">(+) – </w:t>
       </w:r>
       <w:r>
@@ -595,7 +720,19 @@
         <w:rPr>
           <w:rFonts w:ascii="Times New Roman" w:hAnsi="Times New Roman" w:cs="Times New Roman"/>
         </w:rPr>
-        <w:t>arebná konzistentnosť snímok s tabuľkou</w:t>
+        <w:t>arebná konzistentnosť snímok s</w:t>
+      </w:r>
+      <w:r>
+        <w:rPr>
+          <w:rFonts w:ascii="Times New Roman" w:hAnsi="Times New Roman" w:cs="Times New Roman"/>
+        </w:rPr>
+        <w:t> </w:t>
+      </w:r>
+      <w:r>
+        <w:rPr>
+          <w:rFonts w:ascii="Times New Roman" w:hAnsi="Times New Roman" w:cs="Times New Roman"/>
+        </w:rPr>
+        <w:t>tabuľkou</w:t>
       </w:r>
     </w:p>
     <w:p>
@@ -1073,7 +1210,7 @@
   <w:style w:type="paragraph" w:default="1" w:styleId="Normlny">
     <w:name w:val="Normal"/>
     <w:qFormat/>
-    <w:rsid w:val="003768DF"/>
+    <w:rsid w:val="003F4841"/>
   </w:style>
   <w:style w:type="paragraph" w:styleId="Nadpis1">
     <w:name w:val="heading 1"/>

</xml_diff>